<commit_message>
agregue el pdf del laboratorio
</commit_message>
<xml_diff>
--- a/PseInt/EjercicioSemana6/EJERCICIO_DE_LABORATORIO.docx
+++ b/PseInt/EjercicioSemana6/EJERCICIO_DE_LABORATORIO.docx
@@ -266,7 +266,23 @@
         </w:drawing>
       </w:r>
       <w:r>
-        <w:t>Asignamos un valor a nuestra variante que en este caso seria   el valor de numero será dado mas adelante y se acumulará.</w:t>
+        <w:t xml:space="preserve">Asignamos un valor a nuestra variante que en este caso </w:t>
+      </w:r>
+      <w:proofErr w:type="spellStart"/>
+      <w:r>
+        <w:t>seria</w:t>
+      </w:r>
+      <w:proofErr w:type="spellEnd"/>
+      <w:r>
+        <w:t xml:space="preserve">   el valor de numero será dado </w:t>
+      </w:r>
+      <w:proofErr w:type="spellStart"/>
+      <w:r>
+        <w:t>mas</w:t>
+      </w:r>
+      <w:proofErr w:type="spellEnd"/>
+      <w:r>
+        <w:t xml:space="preserve"> adelante y se acumulará.</w:t>
       </w:r>
     </w:p>
     <w:p>
@@ -685,9 +701,11 @@
       <w:r>
         <w:t xml:space="preserve">dato </w:t>
       </w:r>
+      <w:proofErr w:type="spellStart"/>
       <w:r>
         <w:t>numerico</w:t>
       </w:r>
+      <w:proofErr w:type="spellEnd"/>
       <w:r>
         <w:t>.</w:t>
       </w:r>
@@ -787,7 +805,15 @@
         <w:t>hay que decir</w:t>
       </w:r>
       <w:r>
-        <w:t xml:space="preserve"> también que ese numero se ira a cumulando hasta que se cumpla una condición.</w:t>
+        <w:t xml:space="preserve"> también que ese </w:t>
+      </w:r>
+      <w:proofErr w:type="spellStart"/>
+      <w:r>
+        <w:t>numero</w:t>
+      </w:r>
+      <w:proofErr w:type="spellEnd"/>
+      <w:r>
+        <w:t xml:space="preserve"> se ira a cumulando hasta que se cumpla una condición.</w:t>
       </w:r>
     </w:p>
     <w:p>
@@ -1115,22 +1141,23 @@
         <w:t xml:space="preserve"> los numeros acumulados.</w:t>
       </w:r>
     </w:p>
+    <w:p/>
     <w:p>
       <w:r>
         <w:rPr>
           <w:noProof/>
         </w:rPr>
         <w:drawing>
-          <wp:anchor distT="0" distB="0" distL="114300" distR="114300" simplePos="0" relativeHeight="251660288" behindDoc="0" locked="0" layoutInCell="1" allowOverlap="1" wp14:anchorId="4C21AD25" wp14:editId="092C3A05">
+          <wp:anchor distT="0" distB="0" distL="114300" distR="114300" simplePos="0" relativeHeight="251660288" behindDoc="0" locked="0" layoutInCell="1" allowOverlap="1" wp14:anchorId="4C21AD25" wp14:editId="2F8C648E">
             <wp:simplePos x="0" y="0"/>
             <wp:positionH relativeFrom="margin">
-              <wp:posOffset>1077671</wp:posOffset>
+              <wp:posOffset>1420724</wp:posOffset>
             </wp:positionH>
             <wp:positionV relativeFrom="paragraph">
-              <wp:posOffset>503327</wp:posOffset>
+              <wp:posOffset>144501</wp:posOffset>
             </wp:positionV>
-            <wp:extent cx="2787015" cy="3187065"/>
-            <wp:effectExtent l="0" t="0" r="0" b="0"/>
+            <wp:extent cx="2362200" cy="2701290"/>
+            <wp:effectExtent l="0" t="0" r="0" b="3810"/>
             <wp:wrapSquare wrapText="bothSides"/>
             <wp:docPr id="956374090" name="Imagen 8"/>
             <wp:cNvGraphicFramePr>
@@ -1158,7 +1185,7 @@
                   <pic:spPr>
                     <a:xfrm>
                       <a:off x="0" y="0"/>
-                      <a:ext cx="2787015" cy="3187065"/>
+                      <a:ext cx="2362200" cy="2701290"/>
                     </a:xfrm>
                     <a:prstGeom prst="rect">
                       <a:avLst/>
@@ -1175,6 +1202,42 @@
             </wp14:sizeRelV>
           </wp:anchor>
         </w:drawing>
+      </w:r>
+    </w:p>
+    <w:p/>
+    <w:p/>
+    <w:p/>
+    <w:p/>
+    <w:p/>
+    <w:p/>
+    <w:p/>
+    <w:p/>
+    <w:p/>
+    <w:p>
+      <w:pPr>
+        <w:rPr>
+          <w:lang w:val="en-US"/>
+        </w:rPr>
+      </w:pPr>
+      <w:proofErr w:type="spellStart"/>
+      <w:r>
+        <w:rPr>
+          <w:lang w:val="en-US"/>
+        </w:rPr>
+        <w:t>Github</w:t>
+      </w:r>
+      <w:proofErr w:type="spellEnd"/>
+      <w:r>
+        <w:rPr>
+          <w:lang w:val="en-US"/>
+        </w:rPr>
+        <w:t xml:space="preserve">: </w:t>
+      </w:r>
+      <w:r>
+        <w:rPr>
+          <w:lang w:val="en-US"/>
+        </w:rPr>
+        <w:t>https://github.com/TheIsaac503/MiprimerRepositorio.git</w:t>
       </w:r>
     </w:p>
     <w:sectPr>
@@ -1912,6 +1975,7 @@
   <w:style w:type="character" w:default="1" w:styleId="Fuentedeprrafopredeter">
     <w:name w:val="Default Paragraph Font"/>
     <w:uiPriority w:val="1"/>
+    <w:semiHidden/>
     <w:unhideWhenUsed/>
   </w:style>
   <w:style w:type="table" w:default="1" w:styleId="Tablanormal">

</xml_diff>